<commit_message>
Generate exact Question-specific outputs (audit.json, nap_report.json, answer.json) and input matrix matching brief specs
</commit_message>
<xml_diff>
--- a/outputs/test_inputs.docx
+++ b/outputs/test_inputs.docx
@@ -8,34 +8,9 @@
           <w:rFonts w:ascii="Arial" w:hAnsi="Arial"/>
           <w:b/>
           <w:color w:val="1F4E78"/>
-          <w:sz w:val="40"/>
+          <w:sz w:val="32"/>
         </w:rPr>
-        <w:t>Evidence-Grounded SEO Audit Agent</w:t>
-      </w:r>
-    </w:p>
-    <w:p>
-      <w:r>
-        <w:rPr>
-          <w:rFonts w:ascii="Arial" w:hAnsi="Arial"/>
-          <w:i/>
-          <w:color w:val="595959"/>
-          <w:sz w:val="26"/>
-        </w:rPr>
-        <w:t>Test Inputs &amp; Execution Parameters Matrix (Q1, Q2, Q3)</w:t>
-      </w:r>
-    </w:p>
-    <w:p>
-      <w:r>
-        <w:t>This document details all test input parameters evaluated across the 3 core requirements:</w:t>
-      </w:r>
-    </w:p>
-    <w:p>
-      <w:r>
-        <w:t>1. Q1 — Technical &amp; On-Page SEO Audit Findings</w:t>
-        <w:br/>
-        <w:t>2. Q2 — Name, Address, Phone (NAP) Consistency Audit</w:t>
-        <w:br/>
-        <w:t>3. Q3 — Evidence-Grounded Question Answering (QA)</w:t>
+        <w:t>Evidence-Grounded SEO Audit Agent — Test Inputs Matrix</w:t>
       </w:r>
     </w:p>
     <w:tbl>
@@ -45,17 +20,16 @@
         <w:tblLook w:firstColumn="1" w:firstRow="1" w:lastColumn="0" w:lastRow="0" w:noHBand="0" w:noVBand="1" w:val="04A0"/>
       </w:tblPr>
       <w:tblGrid>
-        <w:gridCol w:w="1440"/>
-        <w:gridCol w:w="1440"/>
-        <w:gridCol w:w="1440"/>
-        <w:gridCol w:w="1440"/>
-        <w:gridCol w:w="1440"/>
-        <w:gridCol w:w="1440"/>
+        <w:gridCol w:w="1728"/>
+        <w:gridCol w:w="1728"/>
+        <w:gridCol w:w="1728"/>
+        <w:gridCol w:w="1728"/>
+        <w:gridCol w:w="1728"/>
       </w:tblGrid>
       <w:tr>
         <w:tc>
           <w:tcPr>
-            <w:tcW w:type="dxa" w:w="1440"/>
+            <w:tcW w:type="dxa" w:w="1728"/>
             <w:shd w:fill="1F4E78"/>
           </w:tcPr>
           <w:p>
@@ -65,13 +39,13 @@
                 <w:color w:val="FFFFFF"/>
                 <w:sz w:val="19"/>
               </w:rPr>
-              <w:t>ID</w:t>
+              <w:t>Test ID</w:t>
             </w:r>
           </w:p>
         </w:tc>
         <w:tc>
           <w:tcPr>
-            <w:tcW w:type="dxa" w:w="1440"/>
+            <w:tcW w:type="dxa" w:w="1728"/>
             <w:shd w:fill="1F4E78"/>
           </w:tcPr>
           <w:p>
@@ -81,13 +55,13 @@
                 <w:color w:val="FFFFFF"/>
                 <w:sz w:val="19"/>
               </w:rPr>
-              <w:t>Scope</w:t>
+              <w:t>Category / Scope</w:t>
             </w:r>
           </w:p>
         </w:tc>
         <w:tc>
           <w:tcPr>
-            <w:tcW w:type="dxa" w:w="1440"/>
+            <w:tcW w:type="dxa" w:w="1728"/>
             <w:shd w:fill="1F4E78"/>
           </w:tcPr>
           <w:p>
@@ -97,13 +71,13 @@
                 <w:color w:val="FFFFFF"/>
                 <w:sz w:val="19"/>
               </w:rPr>
-              <w:t>Target URL</w:t>
+              <w:t>Target Website URL</w:t>
             </w:r>
           </w:p>
         </w:tc>
         <w:tc>
           <w:tcPr>
-            <w:tcW w:type="dxa" w:w="1440"/>
+            <w:tcW w:type="dxa" w:w="1728"/>
             <w:shd w:fill="1F4E78"/>
           </w:tcPr>
           <w:p>
@@ -113,13 +87,13 @@
                 <w:color w:val="FFFFFF"/>
                 <w:sz w:val="19"/>
               </w:rPr>
-              <w:t>Question (Q3)</w:t>
+              <w:t>User Question (Q3)</w:t>
             </w:r>
           </w:p>
         </w:tc>
         <w:tc>
           <w:tcPr>
-            <w:tcW w:type="dxa" w:w="1440"/>
+            <w:tcW w:type="dxa" w:w="1728"/>
             <w:shd w:fill="1F4E78"/>
           </w:tcPr>
           <w:p>
@@ -129,23 +103,7 @@
                 <w:color w:val="FFFFFF"/>
                 <w:sz w:val="19"/>
               </w:rPr>
-              <w:t>Limits</w:t>
-            </w:r>
-          </w:p>
-        </w:tc>
-        <w:tc>
-          <w:tcPr>
-            <w:tcW w:type="dxa" w:w="1440"/>
-            <w:shd w:fill="1F4E78"/>
-          </w:tcPr>
-          <w:p>
-            <w:r>
-              <w:rPr>
-                <w:b/>
-                <w:color w:val="FFFFFF"/>
-                <w:sz w:val="19"/>
-              </w:rPr>
-              <w:t>Objective</w:t>
+              <w:t>Description &amp; Objective</w:t>
             </w:r>
           </w:p>
         </w:tc>
@@ -153,7 +111,7 @@
       <w:tr>
         <w:tc>
           <w:tcPr>
-            <w:tcW w:type="dxa" w:w="1440"/>
+            <w:tcW w:type="dxa" w:w="1728"/>
           </w:tcPr>
           <w:p>
             <w:r>
@@ -167,7 +125,7 @@
         </w:tc>
         <w:tc>
           <w:tcPr>
-            <w:tcW w:type="dxa" w:w="1440"/>
+            <w:tcW w:type="dxa" w:w="1728"/>
           </w:tcPr>
           <w:p>
             <w:r>
@@ -181,7 +139,7 @@
         </w:tc>
         <w:tc>
           <w:tcPr>
-            <w:tcW w:type="dxa" w:w="1440"/>
+            <w:tcW w:type="dxa" w:w="1728"/>
           </w:tcPr>
           <w:p>
             <w:r>
@@ -195,7 +153,7 @@
         </w:tc>
         <w:tc>
           <w:tcPr>
-            <w:tcW w:type="dxa" w:w="1440"/>
+            <w:tcW w:type="dxa" w:w="1728"/>
           </w:tcPr>
           <w:p>
             <w:r>
@@ -209,23 +167,7 @@
         </w:tc>
         <w:tc>
           <w:tcPr>
-            <w:tcW w:type="dxa" w:w="1440"/>
-          </w:tcPr>
-          <w:p>
-            <w:r>
-              <w:rPr>
-                <w:rFonts w:ascii="Arial" w:hAnsi="Arial"/>
-                <w:sz w:val="17"/>
-              </w:rPr>
-              <w:t>Pages: 10</w:t>
-              <w:br/>
-              <w:t>Depth: 2</w:t>
-            </w:r>
-          </w:p>
-        </w:tc>
-        <w:tc>
-          <w:tcPr>
-            <w:tcW w:type="dxa" w:w="1440"/>
+            <w:tcW w:type="dxa" w:w="1728"/>
           </w:tcPr>
           <w:p>
             <w:r>
@@ -241,7 +183,7 @@
       <w:tr>
         <w:tc>
           <w:tcPr>
-            <w:tcW w:type="dxa" w:w="1440"/>
+            <w:tcW w:type="dxa" w:w="1728"/>
           </w:tcPr>
           <w:p>
             <w:r>
@@ -255,7 +197,7 @@
         </w:tc>
         <w:tc>
           <w:tcPr>
-            <w:tcW w:type="dxa" w:w="1440"/>
+            <w:tcW w:type="dxa" w:w="1728"/>
           </w:tcPr>
           <w:p>
             <w:r>
@@ -269,7 +211,7 @@
         </w:tc>
         <w:tc>
           <w:tcPr>
-            <w:tcW w:type="dxa" w:w="1440"/>
+            <w:tcW w:type="dxa" w:w="1728"/>
           </w:tcPr>
           <w:p>
             <w:r>
@@ -283,7 +225,7 @@
         </w:tc>
         <w:tc>
           <w:tcPr>
-            <w:tcW w:type="dxa" w:w="1440"/>
+            <w:tcW w:type="dxa" w:w="1728"/>
           </w:tcPr>
           <w:p>
             <w:r>
@@ -297,23 +239,7 @@
         </w:tc>
         <w:tc>
           <w:tcPr>
-            <w:tcW w:type="dxa" w:w="1440"/>
-          </w:tcPr>
-          <w:p>
-            <w:r>
-              <w:rPr>
-                <w:rFonts w:ascii="Arial" w:hAnsi="Arial"/>
-                <w:sz w:val="17"/>
-              </w:rPr>
-              <w:t>Pages: 10</w:t>
-              <w:br/>
-              <w:t>Depth: 2</w:t>
-            </w:r>
-          </w:p>
-        </w:tc>
-        <w:tc>
-          <w:tcPr>
-            <w:tcW w:type="dxa" w:w="1440"/>
+            <w:tcW w:type="dxa" w:w="1728"/>
           </w:tcPr>
           <w:p>
             <w:r>
@@ -329,7 +255,7 @@
       <w:tr>
         <w:tc>
           <w:tcPr>
-            <w:tcW w:type="dxa" w:w="1440"/>
+            <w:tcW w:type="dxa" w:w="1728"/>
           </w:tcPr>
           <w:p>
             <w:r>
@@ -343,7 +269,7 @@
         </w:tc>
         <w:tc>
           <w:tcPr>
-            <w:tcW w:type="dxa" w:w="1440"/>
+            <w:tcW w:type="dxa" w:w="1728"/>
           </w:tcPr>
           <w:p>
             <w:r>
@@ -357,7 +283,7 @@
         </w:tc>
         <w:tc>
           <w:tcPr>
-            <w:tcW w:type="dxa" w:w="1440"/>
+            <w:tcW w:type="dxa" w:w="1728"/>
           </w:tcPr>
           <w:p>
             <w:r>
@@ -371,7 +297,7 @@
         </w:tc>
         <w:tc>
           <w:tcPr>
-            <w:tcW w:type="dxa" w:w="1440"/>
+            <w:tcW w:type="dxa" w:w="1728"/>
           </w:tcPr>
           <w:p>
             <w:r>
@@ -379,29 +305,13 @@
                 <w:rFonts w:ascii="Arial" w:hAnsi="Arial"/>
                 <w:sz w:val="17"/>
               </w:rPr>
-              <w:t>N/A</w:t>
+              <w:t>N/A (Crawl/Audit Only)</w:t>
             </w:r>
           </w:p>
         </w:tc>
         <w:tc>
           <w:tcPr>
-            <w:tcW w:type="dxa" w:w="1440"/>
-          </w:tcPr>
-          <w:p>
-            <w:r>
-              <w:rPr>
-                <w:rFonts w:ascii="Arial" w:hAnsi="Arial"/>
-                <w:sz w:val="17"/>
-              </w:rPr>
-              <w:t>Pages: 10</w:t>
-              <w:br/>
-              <w:t>Depth: 2</w:t>
-            </w:r>
-          </w:p>
-        </w:tc>
-        <w:tc>
-          <w:tcPr>
-            <w:tcW w:type="dxa" w:w="1440"/>
+            <w:tcW w:type="dxa" w:w="1728"/>
           </w:tcPr>
           <w:p>
             <w:r>
@@ -417,7 +327,7 @@
       <w:tr>
         <w:tc>
           <w:tcPr>
-            <w:tcW w:type="dxa" w:w="1440"/>
+            <w:tcW w:type="dxa" w:w="1728"/>
           </w:tcPr>
           <w:p>
             <w:r>
@@ -431,7 +341,7 @@
         </w:tc>
         <w:tc>
           <w:tcPr>
-            <w:tcW w:type="dxa" w:w="1440"/>
+            <w:tcW w:type="dxa" w:w="1728"/>
           </w:tcPr>
           <w:p>
             <w:r>
@@ -445,7 +355,7 @@
         </w:tc>
         <w:tc>
           <w:tcPr>
-            <w:tcW w:type="dxa" w:w="1440"/>
+            <w:tcW w:type="dxa" w:w="1728"/>
           </w:tcPr>
           <w:p>
             <w:r>
@@ -459,7 +369,7 @@
         </w:tc>
         <w:tc>
           <w:tcPr>
-            <w:tcW w:type="dxa" w:w="1440"/>
+            <w:tcW w:type="dxa" w:w="1728"/>
           </w:tcPr>
           <w:p>
             <w:r>
@@ -467,29 +377,13 @@
                 <w:rFonts w:ascii="Arial" w:hAnsi="Arial"/>
                 <w:sz w:val="17"/>
               </w:rPr>
-              <w:t>N/A</w:t>
+              <w:t>N/A (Crawl/Audit Only)</w:t>
             </w:r>
           </w:p>
         </w:tc>
         <w:tc>
           <w:tcPr>
-            <w:tcW w:type="dxa" w:w="1440"/>
-          </w:tcPr>
-          <w:p>
-            <w:r>
-              <w:rPr>
-                <w:rFonts w:ascii="Arial" w:hAnsi="Arial"/>
-                <w:sz w:val="17"/>
-              </w:rPr>
-              <w:t>Pages: 10</w:t>
-              <w:br/>
-              <w:t>Depth: 2</w:t>
-            </w:r>
-          </w:p>
-        </w:tc>
-        <w:tc>
-          <w:tcPr>
-            <w:tcW w:type="dxa" w:w="1440"/>
+            <w:tcW w:type="dxa" w:w="1728"/>
           </w:tcPr>
           <w:p>
             <w:r>
@@ -505,7 +399,7 @@
       <w:tr>
         <w:tc>
           <w:tcPr>
-            <w:tcW w:type="dxa" w:w="1440"/>
+            <w:tcW w:type="dxa" w:w="1728"/>
           </w:tcPr>
           <w:p>
             <w:r>
@@ -519,7 +413,7 @@
         </w:tc>
         <w:tc>
           <w:tcPr>
-            <w:tcW w:type="dxa" w:w="1440"/>
+            <w:tcW w:type="dxa" w:w="1728"/>
           </w:tcPr>
           <w:p>
             <w:r>
@@ -533,7 +427,7 @@
         </w:tc>
         <w:tc>
           <w:tcPr>
-            <w:tcW w:type="dxa" w:w="1440"/>
+            <w:tcW w:type="dxa" w:w="1728"/>
           </w:tcPr>
           <w:p>
             <w:r>
@@ -547,7 +441,7 @@
         </w:tc>
         <w:tc>
           <w:tcPr>
-            <w:tcW w:type="dxa" w:w="1440"/>
+            <w:tcW w:type="dxa" w:w="1728"/>
           </w:tcPr>
           <w:p>
             <w:r>
@@ -555,29 +449,13 @@
                 <w:rFonts w:ascii="Arial" w:hAnsi="Arial"/>
                 <w:sz w:val="17"/>
               </w:rPr>
-              <w:t>N/A</w:t>
+              <w:t>N/A (Crawl/Audit Only)</w:t>
             </w:r>
           </w:p>
         </w:tc>
         <w:tc>
           <w:tcPr>
-            <w:tcW w:type="dxa" w:w="1440"/>
-          </w:tcPr>
-          <w:p>
-            <w:r>
-              <w:rPr>
-                <w:rFonts w:ascii="Arial" w:hAnsi="Arial"/>
-                <w:sz w:val="17"/>
-              </w:rPr>
-              <w:t>Pages: 10</w:t>
-              <w:br/>
-              <w:t>Depth: 2</w:t>
-            </w:r>
-          </w:p>
-        </w:tc>
-        <w:tc>
-          <w:tcPr>
-            <w:tcW w:type="dxa" w:w="1440"/>
+            <w:tcW w:type="dxa" w:w="1728"/>
           </w:tcPr>
           <w:p>
             <w:r>
@@ -593,7 +471,7 @@
       <w:tr>
         <w:tc>
           <w:tcPr>
-            <w:tcW w:type="dxa" w:w="1440"/>
+            <w:tcW w:type="dxa" w:w="1728"/>
           </w:tcPr>
           <w:p>
             <w:r>
@@ -607,7 +485,7 @@
         </w:tc>
         <w:tc>
           <w:tcPr>
-            <w:tcW w:type="dxa" w:w="1440"/>
+            <w:tcW w:type="dxa" w:w="1728"/>
           </w:tcPr>
           <w:p>
             <w:r>
@@ -621,7 +499,7 @@
         </w:tc>
         <w:tc>
           <w:tcPr>
-            <w:tcW w:type="dxa" w:w="1440"/>
+            <w:tcW w:type="dxa" w:w="1728"/>
           </w:tcPr>
           <w:p>
             <w:r>
@@ -635,7 +513,7 @@
         </w:tc>
         <w:tc>
           <w:tcPr>
-            <w:tcW w:type="dxa" w:w="1440"/>
+            <w:tcW w:type="dxa" w:w="1728"/>
           </w:tcPr>
           <w:p>
             <w:r>
@@ -649,23 +527,7 @@
         </w:tc>
         <w:tc>
           <w:tcPr>
-            <w:tcW w:type="dxa" w:w="1440"/>
-          </w:tcPr>
-          <w:p>
-            <w:r>
-              <w:rPr>
-                <w:rFonts w:ascii="Arial" w:hAnsi="Arial"/>
-                <w:sz w:val="17"/>
-              </w:rPr>
-              <w:t>Pages: 10</w:t>
-              <w:br/>
-              <w:t>Depth: 2</w:t>
-            </w:r>
-          </w:p>
-        </w:tc>
-        <w:tc>
-          <w:tcPr>
-            <w:tcW w:type="dxa" w:w="1440"/>
+            <w:tcW w:type="dxa" w:w="1728"/>
           </w:tcPr>
           <w:p>
             <w:r>
@@ -681,7 +543,7 @@
       <w:tr>
         <w:tc>
           <w:tcPr>
-            <w:tcW w:type="dxa" w:w="1440"/>
+            <w:tcW w:type="dxa" w:w="1728"/>
           </w:tcPr>
           <w:p>
             <w:r>
@@ -695,7 +557,7 @@
         </w:tc>
         <w:tc>
           <w:tcPr>
-            <w:tcW w:type="dxa" w:w="1440"/>
+            <w:tcW w:type="dxa" w:w="1728"/>
           </w:tcPr>
           <w:p>
             <w:r>
@@ -709,7 +571,7 @@
         </w:tc>
         <w:tc>
           <w:tcPr>
-            <w:tcW w:type="dxa" w:w="1440"/>
+            <w:tcW w:type="dxa" w:w="1728"/>
           </w:tcPr>
           <w:p>
             <w:r>
@@ -723,7 +585,7 @@
         </w:tc>
         <w:tc>
           <w:tcPr>
-            <w:tcW w:type="dxa" w:w="1440"/>
+            <w:tcW w:type="dxa" w:w="1728"/>
           </w:tcPr>
           <w:p>
             <w:r>
@@ -737,23 +599,7 @@
         </w:tc>
         <w:tc>
           <w:tcPr>
-            <w:tcW w:type="dxa" w:w="1440"/>
-          </w:tcPr>
-          <w:p>
-            <w:r>
-              <w:rPr>
-                <w:rFonts w:ascii="Arial" w:hAnsi="Arial"/>
-                <w:sz w:val="17"/>
-              </w:rPr>
-              <w:t>Pages: 10</w:t>
-              <w:br/>
-              <w:t>Depth: 2</w:t>
-            </w:r>
-          </w:p>
-        </w:tc>
-        <w:tc>
-          <w:tcPr>
-            <w:tcW w:type="dxa" w:w="1440"/>
+            <w:tcW w:type="dxa" w:w="1728"/>
           </w:tcPr>
           <w:p>
             <w:r>
@@ -769,7 +615,7 @@
       <w:tr>
         <w:tc>
           <w:tcPr>
-            <w:tcW w:type="dxa" w:w="1440"/>
+            <w:tcW w:type="dxa" w:w="1728"/>
           </w:tcPr>
           <w:p>
             <w:r>
@@ -783,7 +629,7 @@
         </w:tc>
         <w:tc>
           <w:tcPr>
-            <w:tcW w:type="dxa" w:w="1440"/>
+            <w:tcW w:type="dxa" w:w="1728"/>
           </w:tcPr>
           <w:p>
             <w:r>
@@ -797,7 +643,7 @@
         </w:tc>
         <w:tc>
           <w:tcPr>
-            <w:tcW w:type="dxa" w:w="1440"/>
+            <w:tcW w:type="dxa" w:w="1728"/>
           </w:tcPr>
           <w:p>
             <w:r>
@@ -811,7 +657,7 @@
         </w:tc>
         <w:tc>
           <w:tcPr>
-            <w:tcW w:type="dxa" w:w="1440"/>
+            <w:tcW w:type="dxa" w:w="1728"/>
           </w:tcPr>
           <w:p>
             <w:r>
@@ -825,23 +671,7 @@
         </w:tc>
         <w:tc>
           <w:tcPr>
-            <w:tcW w:type="dxa" w:w="1440"/>
-          </w:tcPr>
-          <w:p>
-            <w:r>
-              <w:rPr>
-                <w:rFonts w:ascii="Arial" w:hAnsi="Arial"/>
-                <w:sz w:val="17"/>
-              </w:rPr>
-              <w:t>Pages: 10</w:t>
-              <w:br/>
-              <w:t>Depth: 2</w:t>
-            </w:r>
-          </w:p>
-        </w:tc>
-        <w:tc>
-          <w:tcPr>
-            <w:tcW w:type="dxa" w:w="1440"/>
+            <w:tcW w:type="dxa" w:w="1728"/>
           </w:tcPr>
           <w:p>
             <w:r>
@@ -857,7 +687,7 @@
       <w:tr>
         <w:tc>
           <w:tcPr>
-            <w:tcW w:type="dxa" w:w="1440"/>
+            <w:tcW w:type="dxa" w:w="1728"/>
           </w:tcPr>
           <w:p>
             <w:r>
@@ -871,7 +701,7 @@
         </w:tc>
         <w:tc>
           <w:tcPr>
-            <w:tcW w:type="dxa" w:w="1440"/>
+            <w:tcW w:type="dxa" w:w="1728"/>
           </w:tcPr>
           <w:p>
             <w:r>
@@ -885,7 +715,7 @@
         </w:tc>
         <w:tc>
           <w:tcPr>
-            <w:tcW w:type="dxa" w:w="1440"/>
+            <w:tcW w:type="dxa" w:w="1728"/>
           </w:tcPr>
           <w:p>
             <w:r>
@@ -899,7 +729,7 @@
         </w:tc>
         <w:tc>
           <w:tcPr>
-            <w:tcW w:type="dxa" w:w="1440"/>
+            <w:tcW w:type="dxa" w:w="1728"/>
           </w:tcPr>
           <w:p>
             <w:r>
@@ -907,29 +737,13 @@
                 <w:rFonts w:ascii="Arial" w:hAnsi="Arial"/>
                 <w:sz w:val="17"/>
               </w:rPr>
-              <w:t>N/A</w:t>
+              <w:t>N/A (Crawl/Audit Only)</w:t>
             </w:r>
           </w:p>
         </w:tc>
         <w:tc>
           <w:tcPr>
-            <w:tcW w:type="dxa" w:w="1440"/>
-          </w:tcPr>
-          <w:p>
-            <w:r>
-              <w:rPr>
-                <w:rFonts w:ascii="Arial" w:hAnsi="Arial"/>
-                <w:sz w:val="17"/>
-              </w:rPr>
-              <w:t>Pages: 10</w:t>
-              <w:br/>
-              <w:t>Depth: 2</w:t>
-            </w:r>
-          </w:p>
-        </w:tc>
-        <w:tc>
-          <w:tcPr>
-            <w:tcW w:type="dxa" w:w="1440"/>
+            <w:tcW w:type="dxa" w:w="1728"/>
           </w:tcPr>
           <w:p>
             <w:r>
@@ -945,7 +759,7 @@
       <w:tr>
         <w:tc>
           <w:tcPr>
-            <w:tcW w:type="dxa" w:w="1440"/>
+            <w:tcW w:type="dxa" w:w="1728"/>
           </w:tcPr>
           <w:p>
             <w:r>
@@ -959,7 +773,7 @@
         </w:tc>
         <w:tc>
           <w:tcPr>
-            <w:tcW w:type="dxa" w:w="1440"/>
+            <w:tcW w:type="dxa" w:w="1728"/>
           </w:tcPr>
           <w:p>
             <w:r>
@@ -973,7 +787,7 @@
         </w:tc>
         <w:tc>
           <w:tcPr>
-            <w:tcW w:type="dxa" w:w="1440"/>
+            <w:tcW w:type="dxa" w:w="1728"/>
           </w:tcPr>
           <w:p>
             <w:r>
@@ -987,7 +801,7 @@
         </w:tc>
         <w:tc>
           <w:tcPr>
-            <w:tcW w:type="dxa" w:w="1440"/>
+            <w:tcW w:type="dxa" w:w="1728"/>
           </w:tcPr>
           <w:p>
             <w:r>
@@ -995,29 +809,13 @@
                 <w:rFonts w:ascii="Arial" w:hAnsi="Arial"/>
                 <w:sz w:val="17"/>
               </w:rPr>
-              <w:t>N/A</w:t>
+              <w:t>N/A (Crawl/Audit Only)</w:t>
             </w:r>
           </w:p>
         </w:tc>
         <w:tc>
           <w:tcPr>
-            <w:tcW w:type="dxa" w:w="1440"/>
-          </w:tcPr>
-          <w:p>
-            <w:r>
-              <w:rPr>
-                <w:rFonts w:ascii="Arial" w:hAnsi="Arial"/>
-                <w:sz w:val="17"/>
-              </w:rPr>
-              <w:t>Pages: 10</w:t>
-              <w:br/>
-              <w:t>Depth: 2</w:t>
-            </w:r>
-          </w:p>
-        </w:tc>
-        <w:tc>
-          <w:tcPr>
-            <w:tcW w:type="dxa" w:w="1440"/>
+            <w:tcW w:type="dxa" w:w="1728"/>
           </w:tcPr>
           <w:p>
             <w:r>
@@ -1026,6 +824,222 @@
                 <w:sz w:val="17"/>
               </w:rPr>
               <w:t>Run technical &amp; on-page SEO audit findings against python.org.</w:t>
+            </w:r>
+          </w:p>
+        </w:tc>
+      </w:tr>
+      <w:tr>
+        <w:tc>
+          <w:tcPr>
+            <w:tcW w:type="dxa" w:w="1728"/>
+          </w:tcPr>
+          <w:p>
+            <w:r>
+              <w:rPr>
+                <w:rFonts w:ascii="Arial" w:hAnsi="Arial"/>
+                <w:sz w:val="17"/>
+              </w:rPr>
+              <w:t>TC11</w:t>
+            </w:r>
+          </w:p>
+        </w:tc>
+        <w:tc>
+          <w:tcPr>
+            <w:tcW w:type="dxa" w:w="1728"/>
+          </w:tcPr>
+          <w:p>
+            <w:r>
+              <w:rPr>
+                <w:rFonts w:ascii="Arial" w:hAnsi="Arial"/>
+                <w:sz w:val="17"/>
+              </w:rPr>
+              <w:t>Q1 (SEO Audit Findings)</w:t>
+            </w:r>
+          </w:p>
+        </w:tc>
+        <w:tc>
+          <w:tcPr>
+            <w:tcW w:type="dxa" w:w="1728"/>
+          </w:tcPr>
+          <w:p>
+            <w:r>
+              <w:rPr>
+                <w:rFonts w:ascii="Arial" w:hAnsi="Arial"/>
+                <w:sz w:val="17"/>
+              </w:rPr>
+              <w:t>https://ccbp.in/</w:t>
+            </w:r>
+          </w:p>
+        </w:tc>
+        <w:tc>
+          <w:tcPr>
+            <w:tcW w:type="dxa" w:w="1728"/>
+          </w:tcPr>
+          <w:p>
+            <w:r>
+              <w:rPr>
+                <w:rFonts w:ascii="Arial" w:hAnsi="Arial"/>
+                <w:sz w:val="17"/>
+              </w:rPr>
+              <w:t>N/A (Crawl/Audit Only)</w:t>
+            </w:r>
+          </w:p>
+        </w:tc>
+        <w:tc>
+          <w:tcPr>
+            <w:tcW w:type="dxa" w:w="1728"/>
+          </w:tcPr>
+          <w:p>
+            <w:r>
+              <w:rPr>
+                <w:rFonts w:ascii="Arial" w:hAnsi="Arial"/>
+                <w:sz w:val="17"/>
+              </w:rPr>
+              <w:t>Run technical &amp; on-page SEO audit findings against ccbp.in.</w:t>
+            </w:r>
+          </w:p>
+        </w:tc>
+      </w:tr>
+      <w:tr>
+        <w:tc>
+          <w:tcPr>
+            <w:tcW w:type="dxa" w:w="1728"/>
+          </w:tcPr>
+          <w:p>
+            <w:r>
+              <w:rPr>
+                <w:rFonts w:ascii="Arial" w:hAnsi="Arial"/>
+                <w:sz w:val="17"/>
+              </w:rPr>
+              <w:t>TC12</w:t>
+            </w:r>
+          </w:p>
+        </w:tc>
+        <w:tc>
+          <w:tcPr>
+            <w:tcW w:type="dxa" w:w="1728"/>
+          </w:tcPr>
+          <w:p>
+            <w:r>
+              <w:rPr>
+                <w:rFonts w:ascii="Arial" w:hAnsi="Arial"/>
+                <w:sz w:val="17"/>
+              </w:rPr>
+              <w:t>Q1 (SEO Audit Findings)</w:t>
+            </w:r>
+          </w:p>
+        </w:tc>
+        <w:tc>
+          <w:tcPr>
+            <w:tcW w:type="dxa" w:w="1728"/>
+          </w:tcPr>
+          <w:p>
+            <w:r>
+              <w:rPr>
+                <w:rFonts w:ascii="Arial" w:hAnsi="Arial"/>
+                <w:sz w:val="17"/>
+              </w:rPr>
+              <w:t>https://www.niatindia.com/</w:t>
+            </w:r>
+          </w:p>
+        </w:tc>
+        <w:tc>
+          <w:tcPr>
+            <w:tcW w:type="dxa" w:w="1728"/>
+          </w:tcPr>
+          <w:p>
+            <w:r>
+              <w:rPr>
+                <w:rFonts w:ascii="Arial" w:hAnsi="Arial"/>
+                <w:sz w:val="17"/>
+              </w:rPr>
+              <w:t>N/A (Crawl/Audit Only)</w:t>
+            </w:r>
+          </w:p>
+        </w:tc>
+        <w:tc>
+          <w:tcPr>
+            <w:tcW w:type="dxa" w:w="1728"/>
+          </w:tcPr>
+          <w:p>
+            <w:r>
+              <w:rPr>
+                <w:rFonts w:ascii="Arial" w:hAnsi="Arial"/>
+                <w:sz w:val="17"/>
+              </w:rPr>
+              <w:t>Run technical &amp; on-page SEO audit findings against niatindia.com.</w:t>
+            </w:r>
+          </w:p>
+        </w:tc>
+      </w:tr>
+      <w:tr>
+        <w:tc>
+          <w:tcPr>
+            <w:tcW w:type="dxa" w:w="1728"/>
+          </w:tcPr>
+          <w:p>
+            <w:r>
+              <w:rPr>
+                <w:rFonts w:ascii="Arial" w:hAnsi="Arial"/>
+                <w:sz w:val="17"/>
+              </w:rPr>
+              <w:t>TC13</w:t>
+            </w:r>
+          </w:p>
+        </w:tc>
+        <w:tc>
+          <w:tcPr>
+            <w:tcW w:type="dxa" w:w="1728"/>
+          </w:tcPr>
+          <w:p>
+            <w:r>
+              <w:rPr>
+                <w:rFonts w:ascii="Arial" w:hAnsi="Arial"/>
+                <w:sz w:val="17"/>
+              </w:rPr>
+              <w:t>Q1 (SEO Audit Findings)</w:t>
+            </w:r>
+          </w:p>
+        </w:tc>
+        <w:tc>
+          <w:tcPr>
+            <w:tcW w:type="dxa" w:w="1728"/>
+          </w:tcPr>
+          <w:p>
+            <w:r>
+              <w:rPr>
+                <w:rFonts w:ascii="Arial" w:hAnsi="Arial"/>
+                <w:sz w:val="17"/>
+              </w:rPr>
+              <w:t>https://www.thehudsonkitchen.com/</w:t>
+            </w:r>
+          </w:p>
+        </w:tc>
+        <w:tc>
+          <w:tcPr>
+            <w:tcW w:type="dxa" w:w="1728"/>
+          </w:tcPr>
+          <w:p>
+            <w:r>
+              <w:rPr>
+                <w:rFonts w:ascii="Arial" w:hAnsi="Arial"/>
+                <w:sz w:val="17"/>
+              </w:rPr>
+              <w:t>N/A (Crawl/Audit Only)</w:t>
+            </w:r>
+          </w:p>
+        </w:tc>
+        <w:tc>
+          <w:tcPr>
+            <w:tcW w:type="dxa" w:w="1728"/>
+          </w:tcPr>
+          <w:p>
+            <w:r>
+              <w:rPr>
+                <w:rFonts w:ascii="Arial" w:hAnsi="Arial"/>
+                <w:sz w:val="17"/>
+              </w:rPr>
+              <w:t>Run technical &amp; on-page SEO audit findings against thehudsonkitchen.com.</w:t>
             </w:r>
           </w:p>
         </w:tc>

</xml_diff>